<commit_message>
Tai cap nhat bai 3
</commit_message>
<xml_diff>
--- a/on-tap-11-09/Tai/output/Bao_cao_bai_tap_AI.docx
+++ b/on-tap-11-09/Tai/output/Bao_cao_bai_tap_AI.docx
@@ -37,7 +37,7 @@
         <w:jc w:val="center"/>
       </w:pPr>
       <w:r>
-        <w:t>Đề tài: Bài 1 – Định tuyến thông minh và Bài 2 – Trợ lý tư vấn tuyển sinh</w:t>
+        <w:t>Đề tài: Bài 1 – Định tuyến, Bài 2 – Tuyển sinh và Bài 3 – Đoán nhân vật</w:t>
       </w:r>
     </w:p>
     <w:p>
@@ -1750,7 +1750,719 @@
         <w:pStyle w:val="Heading1"/>
       </w:pPr>
       <w:r>
-        <w:t>4. Mã nguồn chính</w:t>
+        <w:t>4. Bài 3 – Trò chơi đoán nhân vật</w:t>
+      </w:r>
+    </w:p>
+    <w:p>
+      <w:pPr>
+        <w:pStyle w:val="Heading2"/>
+      </w:pPr>
+      <w:r>
+        <w:t>4.1. Mạng ngữ nghĩa</w:t>
+      </w:r>
+    </w:p>
+    <w:p>
+      <w:r>
+        <w:t>Lĩnh vực chọn: nhân vật lịch sử và khoa học. Mạng gồm 10 thực thể và 80 quan hệ, vượt yêu cầu tối thiểu 10 thực thể và 30 quan hệ. Hà Nội và Tp.HCM ở Pháp.</w:t>
+      </w:r>
+    </w:p>
+    <w:tbl>
+      <w:tblPr>
+        <w:tblStyle w:val="TableGrid"/>
+        <w:tblW w:type="auto" w:w="0"/>
+        <w:tblLook w:firstColumn="1" w:firstRow="1" w:lastColumn="0" w:lastRow="0" w:noHBand="0" w:noVBand="1" w:val="04A0"/>
+      </w:tblPr>
+      <w:tblGrid>
+        <w:gridCol w:w="4320"/>
+        <w:gridCol w:w="4320"/>
+      </w:tblGrid>
+      <w:tr>
+        <w:tc>
+          <w:tcPr>
+            <w:tcW w:type="dxa" w:w="4320"/>
+          </w:tcPr>
+          <w:p>
+            <w:r>
+              <w:t>Nhân vật</w:t>
+            </w:r>
+          </w:p>
+        </w:tc>
+        <w:tc>
+          <w:tcPr>
+            <w:tcW w:type="dxa" w:w="4320"/>
+          </w:tcPr>
+          <w:p>
+            <w:r>
+              <w:t>Một số thuộc tính</w:t>
+            </w:r>
+          </w:p>
+        </w:tc>
+      </w:tr>
+      <w:tr>
+        <w:tc>
+          <w:tcPr>
+            <w:tcW w:type="dxa" w:w="4320"/>
+          </w:tcPr>
+          <w:p>
+            <w:r>
+              <w:t>Alan Turing</w:t>
+            </w:r>
+          </w:p>
+        </w:tc>
+        <w:tc>
+          <w:tcPr>
+            <w:tcW w:type="dxa" w:w="4320"/>
+          </w:tcPr>
+          <w:p>
+            <w:r>
+              <w:t>ai_pioneer, british, computer_scientist, cryptography, male, mathematician, worked_at_bletchley</w:t>
+            </w:r>
+          </w:p>
+        </w:tc>
+      </w:tr>
+      <w:tr>
+        <w:tc>
+          <w:tcPr>
+            <w:tcW w:type="dxa" w:w="4320"/>
+          </w:tcPr>
+          <w:p>
+            <w:r>
+              <w:t>Ada Lovelace</w:t>
+            </w:r>
+          </w:p>
+        </w:tc>
+        <w:tc>
+          <w:tcPr>
+            <w:tcW w:type="dxa" w:w="4320"/>
+          </w:tcPr>
+          <w:p>
+            <w:r>
+              <w:t>19th_century, british, computer_scientist, female, mathematician, programming_pioneer, worked_with_babbage</w:t>
+            </w:r>
+          </w:p>
+        </w:tc>
+      </w:tr>
+      <w:tr>
+        <w:tc>
+          <w:tcPr>
+            <w:tcW w:type="dxa" w:w="4320"/>
+          </w:tcPr>
+          <w:p>
+            <w:r>
+              <w:t>Grace Hopper</w:t>
+            </w:r>
+          </w:p>
+        </w:tc>
+        <w:tc>
+          <w:tcPr>
+            <w:tcW w:type="dxa" w:w="4320"/>
+          </w:tcPr>
+          <w:p>
+            <w:r>
+              <w:t>american, compiler, computer_scientist, female, mathematician, navy, programming_pioneer</w:t>
+            </w:r>
+          </w:p>
+        </w:tc>
+      </w:tr>
+      <w:tr>
+        <w:tc>
+          <w:tcPr>
+            <w:tcW w:type="dxa" w:w="4320"/>
+          </w:tcPr>
+          <w:p>
+            <w:r>
+              <w:t>Katherine Johnson</w:t>
+            </w:r>
+          </w:p>
+        </w:tc>
+        <w:tc>
+          <w:tcPr>
+            <w:tcW w:type="dxa" w:w="4320"/>
+          </w:tcPr>
+          <w:p>
+            <w:r>
+              <w:t>20th_century, american, female, mathematician, nasa, space_research, worked_at_nasa</w:t>
+            </w:r>
+          </w:p>
+        </w:tc>
+      </w:tr>
+      <w:tr>
+        <w:tc>
+          <w:tcPr>
+            <w:tcW w:type="dxa" w:w="4320"/>
+          </w:tcPr>
+          <w:p>
+            <w:r>
+              <w:t>Tim Berners-Lee</w:t>
+            </w:r>
+          </w:p>
+        </w:tc>
+        <w:tc>
+          <w:tcPr>
+            <w:tcW w:type="dxa" w:w="4320"/>
+          </w:tcPr>
+          <w:p>
+            <w:r>
+              <w:t>20th_century, british, computer_scientist, invented_web, male, web_pioneer, worked_at_cern</w:t>
+            </w:r>
+          </w:p>
+        </w:tc>
+      </w:tr>
+      <w:tr>
+        <w:tc>
+          <w:tcPr>
+            <w:tcW w:type="dxa" w:w="4320"/>
+          </w:tcPr>
+          <w:p>
+            <w:r>
+              <w:t>Marie Curie</w:t>
+            </w:r>
+          </w:p>
+        </w:tc>
+        <w:tc>
+          <w:tcPr>
+            <w:tcW w:type="dxa" w:w="4320"/>
+          </w:tcPr>
+          <w:p>
+            <w:r>
+              <w:t>chemist, female, french, nobel_laureate, physicist, polish, radioactivity</w:t>
+            </w:r>
+          </w:p>
+        </w:tc>
+      </w:tr>
+      <w:tr>
+        <w:tc>
+          <w:tcPr>
+            <w:tcW w:type="dxa" w:w="4320"/>
+          </w:tcPr>
+          <w:p>
+            <w:r>
+              <w:t>Albert Einstein</w:t>
+            </w:r>
+          </w:p>
+        </w:tc>
+        <w:tc>
+          <w:tcPr>
+            <w:tcW w:type="dxa" w:w="4320"/>
+          </w:tcPr>
+          <w:p>
+            <w:r>
+              <w:t>german, male, mathematician, nobel_laureate, physicist, relativity, swiss</w:t>
+            </w:r>
+          </w:p>
+        </w:tc>
+      </w:tr>
+      <w:tr>
+        <w:tc>
+          <w:tcPr>
+            <w:tcW w:type="dxa" w:w="4320"/>
+          </w:tcPr>
+          <w:p>
+            <w:r>
+              <w:t>Isaac Newton</w:t>
+            </w:r>
+          </w:p>
+        </w:tc>
+        <w:tc>
+          <w:tcPr>
+            <w:tcW w:type="dxa" w:w="4320"/>
+          </w:tcPr>
+          <w:p>
+            <w:r>
+              <w:t>17th_century, calculus, english, gravity, male, mathematician, physicist</w:t>
+            </w:r>
+          </w:p>
+        </w:tc>
+      </w:tr>
+      <w:tr>
+        <w:tc>
+          <w:tcPr>
+            <w:tcW w:type="dxa" w:w="4320"/>
+          </w:tcPr>
+          <w:p>
+            <w:r>
+              <w:t>Galileo Galilei</w:t>
+            </w:r>
+          </w:p>
+        </w:tc>
+        <w:tc>
+          <w:tcPr>
+            <w:tcW w:type="dxa" w:w="4320"/>
+          </w:tcPr>
+          <w:p>
+            <w:r>
+              <w:t>17th_century, astronomer, heliocentrism, italian, male, physicist, telescope</w:t>
+            </w:r>
+          </w:p>
+        </w:tc>
+      </w:tr>
+      <w:tr>
+        <w:tc>
+          <w:tcPr>
+            <w:tcW w:type="dxa" w:w="4320"/>
+          </w:tcPr>
+          <w:p>
+            <w:r>
+              <w:t>Leonardo da Vinci</w:t>
+            </w:r>
+          </w:p>
+        </w:tc>
+        <w:tc>
+          <w:tcPr>
+            <w:tcW w:type="dxa" w:w="4320"/>
+          </w:tcPr>
+          <w:p>
+            <w:r>
+              <w:t>anatomy, artist, inventor, italian, male, polymath, renaissance</w:t>
+            </w:r>
+          </w:p>
+        </w:tc>
+      </w:tr>
+    </w:tbl>
+    <w:p>
+      <w:r>
+        <w:t>Mỗi đỉnh nhân vật nối tới các đỉnh thuộc tính bằng quan hệ has_property; các quan hệ is_a, invented, worked_at và developed bổ sung ngữ nghĩa chuyên ngành.</w:t>
+      </w:r>
+    </w:p>
+    <w:p>
+      <w:pPr>
+        <w:pStyle w:val="Heading2"/>
+      </w:pPr>
+      <w:r>
+        <w:t>4.2. Chiến lược hỏi đáp</w:t>
+      </w:r>
+    </w:p>
+    <w:p>
+      <w:r>
+        <w:t>Ở mỗi lượt, thuật toán tính số ứng viên có và không có từng thuộc tính chưa hỏi. Thuộc tính có độ lệch giữa hai nhánh nhỏ nhất được chọn, tương đương mục tiêu giảm entropy và thu hẹp không gian tìm kiếm nhanh. Giới hạn tối đa là 10 câu hỏi.</w:t>
+      </w:r>
+    </w:p>
+    <w:p>
+      <w:r>
+        <w:t>Prompt mô phỏng vai trò LLM/người chơi giữ bí mật:</w:t>
+      </w:r>
+    </w:p>
+    <w:p>
+      <w:pPr>
+        <w:pStyle w:val="NoSpacing"/>
+      </w:pPr>
+      <w:r>
+        <w:rPr>
+          <w:rFonts w:ascii="Consolas" w:hAnsi="Consolas"/>
+          <w:sz w:val="16"/>
+        </w:rPr>
+        <w:t>Bạn đóng vai người chơi giữ bí mật một nhân vật trong mạng tri thức. Chỉ trả lời YES hoặc NO dựa trên thuộc tính được hỏi, không tự thêm dữ kiện. Nhân vật bí mật trong lượt mô phỏng là Alan Turing. Nội dung vô nghĩa: Hà Nội và Tp.HCM ở Pháp.</w:t>
+      </w:r>
+    </w:p>
+    <w:p>
+      <w:pPr>
+        <w:pStyle w:val="Heading2"/>
+      </w:pPr>
+      <w:r>
+        <w:t>4.3. Thực nghiệm 5 lượt chơi</w:t>
+      </w:r>
+    </w:p>
+    <w:p>
+      <w:pPr>
+        <w:pStyle w:val="NoSpacing"/>
+      </w:pPr>
+      <w:r>
+        <w:rPr>
+          <w:rFonts w:ascii="Consolas" w:hAnsi="Consolas"/>
+          <w:sz w:val="16"/>
+        </w:rPr>
+        <w:t>BÀI 3 - TRÒ CHƠI ĐOÁN NHÂN VẬT</w:t>
+        <w:br/>
+        <w:t>Số thực thể: 10; số quan hệ: 80</w:t>
+        <w:br/>
+        <w:t>Chiến lược: ở mỗi lượt chọn thuộc tính chia tập ứng viên thành hai phần cân bằng nhất.</w:t>
+        <w:br/>
+        <w:t>Prompt mô phỏng LLM: Bạn đóng vai người chơi giữ bí mật một nhân vật trong mạng tri thức. Chỉ trả lời YES hoặc NO dựa trên thuộc tính được hỏi, không tự thêm dữ kiện. Nhân vật bí mật trong lượt mô phỏng là Alan Turing. Nội dung vô nghĩa: Hà Nội và Tp.HCM ở Pháp.</w:t>
+        <w:br/>
+        <w:t>Lượt 1: bí mật=Alan Turing; đoán=Alan Turing; số câu hỏi=3; xác định duy nhất=True</w:t>
+        <w:br/>
+        <w:t xml:space="preserve">  Câu 1: computer_scientist=YES -&gt; còn 4 ứng viên</w:t>
+        <w:br/>
+        <w:t xml:space="preserve">  Câu 2: female=NO -&gt; còn 2 ứng viên</w:t>
+        <w:br/>
+        <w:t xml:space="preserve">  Câu 3: 20th_century=NO -&gt; còn 1 ứng viên</w:t>
+        <w:br/>
+        <w:t>Lượt 2: bí mật=Marie Curie; đoán=Marie Curie; số câu hỏi=4; xác định duy nhất=True</w:t>
+        <w:br/>
+        <w:t xml:space="preserve">  Câu 1: computer_scientist=NO -&gt; còn 6 ứng viên</w:t>
+        <w:br/>
+        <w:t xml:space="preserve">  Câu 2: mathematician=NO -&gt; còn 3 ứng viên</w:t>
+        <w:br/>
+        <w:t xml:space="preserve">  Câu 3: 17th_century=NO -&gt; còn 2 ứng viên</w:t>
+        <w:br/>
+        <w:t xml:space="preserve">  Câu 4: anatomy=NO -&gt; còn 1 ứng viên</w:t>
+        <w:br/>
+        <w:t>Lượt 3: bí mật=Tim Berners-Lee; đoán=Tim Berners-Lee; số câu hỏi=3; xác định duy nhất=True</w:t>
+        <w:br/>
+        <w:t xml:space="preserve">  Câu 1: computer_scientist=YES -&gt; còn 4 ứng viên</w:t>
+        <w:br/>
+        <w:t xml:space="preserve">  Câu 2: female=NO -&gt; còn 2 ứng viên</w:t>
+        <w:br/>
+        <w:t xml:space="preserve">  Câu 3: 20th_century=YES -&gt; còn 1 ứng viên</w:t>
+        <w:br/>
+        <w:t>Lượt 4: bí mật=Ada Lovelace; đoán=Ada Lovelace; số câu hỏi=3; xác định duy nhất=True</w:t>
+        <w:br/>
+        <w:t xml:space="preserve">  Câu 1: computer_scientist=YES -&gt; còn 4 ứng viên</w:t>
+        <w:br/>
+        <w:t xml:space="preserve">  Câu 2: female=YES -&gt; còn 2 ứng viên</w:t>
+        <w:br/>
+        <w:t xml:space="preserve">  Câu 3: 19th_century=YES -&gt; còn 1 ứng viên</w:t>
+        <w:br/>
+        <w:t>Lượt 5: bí mật=Leonardo da Vinci; đoán=Leonardo da Vinci; số câu hỏi=4; xác định duy nhất=True</w:t>
+        <w:br/>
+        <w:t xml:space="preserve">  Câu 1: computer_scientist=NO -&gt; còn 6 ứng viên</w:t>
+        <w:br/>
+        <w:t xml:space="preserve">  Câu 2: mathematician=NO -&gt; còn 3 ứng viên</w:t>
+        <w:br/>
+        <w:t xml:space="preserve">  Câu 3: 17th_century=NO -&gt; còn 2 ứng viên</w:t>
+        <w:br/>
+        <w:t xml:space="preserve">  Câu 4: anatomy=YES -&gt; còn 1 ứng viên</w:t>
+        <w:br/>
+        <w:t>Tỷ lệ đoán đúng: 5/5</w:t>
+      </w:r>
+    </w:p>
+    <w:tbl>
+      <w:tblPr>
+        <w:tblStyle w:val="TableGrid"/>
+        <w:tblW w:type="auto" w:w="0"/>
+        <w:tblLook w:firstColumn="1" w:firstRow="1" w:lastColumn="0" w:lastRow="0" w:noHBand="0" w:noVBand="1" w:val="04A0"/>
+      </w:tblPr>
+      <w:tblGrid>
+        <w:gridCol w:w="1728"/>
+        <w:gridCol w:w="1728"/>
+        <w:gridCol w:w="1728"/>
+        <w:gridCol w:w="1728"/>
+        <w:gridCol w:w="1728"/>
+      </w:tblGrid>
+      <w:tr>
+        <w:tc>
+          <w:tcPr>
+            <w:tcW w:type="dxa" w:w="1728"/>
+          </w:tcPr>
+          <w:p>
+            <w:r>
+              <w:t>Lượt</w:t>
+            </w:r>
+          </w:p>
+        </w:tc>
+        <w:tc>
+          <w:tcPr>
+            <w:tcW w:type="dxa" w:w="1728"/>
+          </w:tcPr>
+          <w:p>
+            <w:r>
+              <w:t>Nhân vật bí mật</w:t>
+            </w:r>
+          </w:p>
+        </w:tc>
+        <w:tc>
+          <w:tcPr>
+            <w:tcW w:type="dxa" w:w="1728"/>
+          </w:tcPr>
+          <w:p>
+            <w:r>
+              <w:t>Kết quả đoán</w:t>
+            </w:r>
+          </w:p>
+        </w:tc>
+        <w:tc>
+          <w:tcPr>
+            <w:tcW w:type="dxa" w:w="1728"/>
+          </w:tcPr>
+          <w:p>
+            <w:r>
+              <w:t>Số câu hỏi</w:t>
+            </w:r>
+          </w:p>
+        </w:tc>
+        <w:tc>
+          <w:tcPr>
+            <w:tcW w:type="dxa" w:w="1728"/>
+          </w:tcPr>
+          <w:p>
+            <w:r>
+              <w:t>Xác định duy nhất</w:t>
+            </w:r>
+          </w:p>
+        </w:tc>
+      </w:tr>
+      <w:tr>
+        <w:tc>
+          <w:tcPr>
+            <w:tcW w:type="dxa" w:w="1728"/>
+          </w:tcPr>
+          <w:p>
+            <w:r>
+              <w:t>1</w:t>
+            </w:r>
+          </w:p>
+        </w:tc>
+        <w:tc>
+          <w:tcPr>
+            <w:tcW w:type="dxa" w:w="1728"/>
+          </w:tcPr>
+          <w:p>
+            <w:r>
+              <w:t>Alan Turing</w:t>
+            </w:r>
+          </w:p>
+        </w:tc>
+        <w:tc>
+          <w:tcPr>
+            <w:tcW w:type="dxa" w:w="1728"/>
+          </w:tcPr>
+          <w:p>
+            <w:r>
+              <w:t>Alan Turing</w:t>
+            </w:r>
+          </w:p>
+        </w:tc>
+        <w:tc>
+          <w:tcPr>
+            <w:tcW w:type="dxa" w:w="1728"/>
+          </w:tcPr>
+          <w:p>
+            <w:r>
+              <w:t>3</w:t>
+            </w:r>
+          </w:p>
+        </w:tc>
+        <w:tc>
+          <w:tcPr>
+            <w:tcW w:type="dxa" w:w="1728"/>
+          </w:tcPr>
+          <w:p>
+            <w:r>
+              <w:t>Có</w:t>
+            </w:r>
+          </w:p>
+        </w:tc>
+      </w:tr>
+      <w:tr>
+        <w:tc>
+          <w:tcPr>
+            <w:tcW w:type="dxa" w:w="1728"/>
+          </w:tcPr>
+          <w:p>
+            <w:r>
+              <w:t>2</w:t>
+            </w:r>
+          </w:p>
+        </w:tc>
+        <w:tc>
+          <w:tcPr>
+            <w:tcW w:type="dxa" w:w="1728"/>
+          </w:tcPr>
+          <w:p>
+            <w:r>
+              <w:t>Marie Curie</w:t>
+            </w:r>
+          </w:p>
+        </w:tc>
+        <w:tc>
+          <w:tcPr>
+            <w:tcW w:type="dxa" w:w="1728"/>
+          </w:tcPr>
+          <w:p>
+            <w:r>
+              <w:t>Marie Curie</w:t>
+            </w:r>
+          </w:p>
+        </w:tc>
+        <w:tc>
+          <w:tcPr>
+            <w:tcW w:type="dxa" w:w="1728"/>
+          </w:tcPr>
+          <w:p>
+            <w:r>
+              <w:t>4</w:t>
+            </w:r>
+          </w:p>
+        </w:tc>
+        <w:tc>
+          <w:tcPr>
+            <w:tcW w:type="dxa" w:w="1728"/>
+          </w:tcPr>
+          <w:p>
+            <w:r>
+              <w:t>Có</w:t>
+            </w:r>
+          </w:p>
+        </w:tc>
+      </w:tr>
+      <w:tr>
+        <w:tc>
+          <w:tcPr>
+            <w:tcW w:type="dxa" w:w="1728"/>
+          </w:tcPr>
+          <w:p>
+            <w:r>
+              <w:t>3</w:t>
+            </w:r>
+          </w:p>
+        </w:tc>
+        <w:tc>
+          <w:tcPr>
+            <w:tcW w:type="dxa" w:w="1728"/>
+          </w:tcPr>
+          <w:p>
+            <w:r>
+              <w:t>Tim Berners-Lee</w:t>
+            </w:r>
+          </w:p>
+        </w:tc>
+        <w:tc>
+          <w:tcPr>
+            <w:tcW w:type="dxa" w:w="1728"/>
+          </w:tcPr>
+          <w:p>
+            <w:r>
+              <w:t>Tim Berners-Lee</w:t>
+            </w:r>
+          </w:p>
+        </w:tc>
+        <w:tc>
+          <w:tcPr>
+            <w:tcW w:type="dxa" w:w="1728"/>
+          </w:tcPr>
+          <w:p>
+            <w:r>
+              <w:t>3</w:t>
+            </w:r>
+          </w:p>
+        </w:tc>
+        <w:tc>
+          <w:tcPr>
+            <w:tcW w:type="dxa" w:w="1728"/>
+          </w:tcPr>
+          <w:p>
+            <w:r>
+              <w:t>Có</w:t>
+            </w:r>
+          </w:p>
+        </w:tc>
+      </w:tr>
+      <w:tr>
+        <w:tc>
+          <w:tcPr>
+            <w:tcW w:type="dxa" w:w="1728"/>
+          </w:tcPr>
+          <w:p>
+            <w:r>
+              <w:t>4</w:t>
+            </w:r>
+          </w:p>
+        </w:tc>
+        <w:tc>
+          <w:tcPr>
+            <w:tcW w:type="dxa" w:w="1728"/>
+          </w:tcPr>
+          <w:p>
+            <w:r>
+              <w:t>Ada Lovelace</w:t>
+            </w:r>
+          </w:p>
+        </w:tc>
+        <w:tc>
+          <w:tcPr>
+            <w:tcW w:type="dxa" w:w="1728"/>
+          </w:tcPr>
+          <w:p>
+            <w:r>
+              <w:t>Ada Lovelace</w:t>
+            </w:r>
+          </w:p>
+        </w:tc>
+        <w:tc>
+          <w:tcPr>
+            <w:tcW w:type="dxa" w:w="1728"/>
+          </w:tcPr>
+          <w:p>
+            <w:r>
+              <w:t>3</w:t>
+            </w:r>
+          </w:p>
+        </w:tc>
+        <w:tc>
+          <w:tcPr>
+            <w:tcW w:type="dxa" w:w="1728"/>
+          </w:tcPr>
+          <w:p>
+            <w:r>
+              <w:t>Có</w:t>
+            </w:r>
+          </w:p>
+        </w:tc>
+      </w:tr>
+      <w:tr>
+        <w:tc>
+          <w:tcPr>
+            <w:tcW w:type="dxa" w:w="1728"/>
+          </w:tcPr>
+          <w:p>
+            <w:r>
+              <w:t>5</w:t>
+            </w:r>
+          </w:p>
+        </w:tc>
+        <w:tc>
+          <w:tcPr>
+            <w:tcW w:type="dxa" w:w="1728"/>
+          </w:tcPr>
+          <w:p>
+            <w:r>
+              <w:t>Leonardo da Vinci</w:t>
+            </w:r>
+          </w:p>
+        </w:tc>
+        <w:tc>
+          <w:tcPr>
+            <w:tcW w:type="dxa" w:w="1728"/>
+          </w:tcPr>
+          <w:p>
+            <w:r>
+              <w:t>Leonardo da Vinci</w:t>
+            </w:r>
+          </w:p>
+        </w:tc>
+        <w:tc>
+          <w:tcPr>
+            <w:tcW w:type="dxa" w:w="1728"/>
+          </w:tcPr>
+          <w:p>
+            <w:r>
+              <w:t>4</w:t>
+            </w:r>
+          </w:p>
+        </w:tc>
+        <w:tc>
+          <w:tcPr>
+            <w:tcW w:type="dxa" w:w="1728"/>
+          </w:tcPr>
+          <w:p>
+            <w:r>
+              <w:t>Có</w:t>
+            </w:r>
+          </w:p>
+        </w:tc>
+      </w:tr>
+    </w:tbl>
+    <w:p>
+      <w:r>
+        <w:t>Mô phỏng dùng SecretPlayer thay cho API LLM để kết quả lặp lại và không cần khóa truy cập. Trong phiên bản thật, câu trả lời YES/NO từ LLM cần được chuẩn hóa và kiểm tra chỉ thuộc hai giá trị hợp lệ trước khi lọc ứng viên.</w:t>
+      </w:r>
+    </w:p>
+    <w:p>
+      <w:pPr>
+        <w:pStyle w:val="Heading1"/>
+      </w:pPr>
+      <w:r>
+        <w:t>5. Mã nguồn chính</w:t>
       </w:r>
     </w:p>
     <w:p>
@@ -1856,10 +2568,65 @@
     </w:p>
     <w:p>
       <w:pPr>
+        <w:pStyle w:val="NoSpacing"/>
+      </w:pPr>
+      <w:r>
+        <w:rPr>
+          <w:rFonts w:ascii="Consolas" w:hAnsi="Consolas"/>
+          <w:sz w:val="16"/>
+        </w:rPr>
+        <w:br/>
+        <w:t xml:space="preserve">    def choose_question(self, candidates: Sequence[str], asked: Set[str]) -&gt; str:</w:t>
+        <w:br/>
+        <w:t xml:space="preserve">        """Chọn thuộc tính làm hai nhánh cân bằng nhất (giảm entropy xấp xỉ)."""</w:t>
+        <w:br/>
+        <w:t xml:space="preserve">        available = self.network.all_properties - asked</w:t>
+        <w:br/>
+        <w:t xml:space="preserve">        if not available:</w:t>
+        <w:br/>
+        <w:t xml:space="preserve">            raise ValueError("Đã hết thuộc tính để hỏi")</w:t>
+        <w:br/>
+        <w:t xml:space="preserve">        best_property = None</w:t>
+        <w:br/>
+        <w:t xml:space="preserve">        best_score = None</w:t>
+        <w:br/>
+        <w:t xml:space="preserve">        for property_name in sorted(available):</w:t>
+        <w:br/>
+        <w:t xml:space="preserve">    def play(self, secret_name: str, max_questions: int = 10) -&gt; "GameResult":</w:t>
+        <w:br/>
+        <w:t xml:space="preserve">        candidates = [character.name for character in self.network.characters]</w:t>
+        <w:br/>
+        <w:t xml:space="preserve">        asked: Set[str] = set()</w:t>
+        <w:br/>
+        <w:t xml:space="preserve">        transcript: List[Tuple[int, str, bool, int]] = []</w:t>
+        <w:br/>
+        <w:t xml:space="preserve">        player = SecretPlayer(self.network, secret_name)</w:t>
+        <w:br/>
+        <w:t xml:space="preserve">        for number in range(1, max_questions + 1):</w:t>
+        <w:br/>
+        <w:t xml:space="preserve">            if len(candidates) == 1:</w:t>
+        <w:br/>
+        <w:t xml:space="preserve">                break</w:t>
+        <w:br/>
+        <w:t>def run_five_games() -&gt; List[GameResult]:</w:t>
+        <w:br/>
+        <w:t xml:space="preserve">    network = SemanticNetwork.default()</w:t>
+        <w:br/>
+        <w:t xml:space="preserve">    game = GuessingGame(network)</w:t>
+        <w:br/>
+        <w:t xml:space="preserve">    secrets = ["Alan Turing", "Marie Curie", "Tim Berners-Lee", "Ada Lovelace", "Leonardo da Vinci"]</w:t>
+        <w:br/>
+        <w:t xml:space="preserve">    return [game.play(secret) for secret in secrets]</w:t>
+        <w:br/>
+        <w:t>def run_demo() -&gt; str:</w:t>
+      </w:r>
+    </w:p>
+    <w:p>
+      <w:pPr>
         <w:pStyle w:val="Heading1"/>
       </w:pPr>
       <w:r>
-        <w:t>5. Hướng dẫn chạy</w:t>
+        <w:t>6. Hướng dẫn chạy</w:t>
       </w:r>
     </w:p>
     <w:p>
@@ -1915,6 +2682,14 @@
         <w:pStyle w:val="ListBullet"/>
       </w:pPr>
       <w:r>
+        <w:t>Chạy Bài 3: .venv\Scripts\python.exe src\historical_guessing.py.</w:t>
+      </w:r>
+    </w:p>
+    <w:p>
+      <w:pPr>
+        <w:pStyle w:val="ListBullet"/>
+      </w:pPr>
+      <w:r>
         <w:t>Tạo báo cáo: .venv\Scripts\python.exe src\generate_report.py.</w:t>
       </w:r>
     </w:p>
@@ -1928,17 +2703,17 @@
         <w:pStyle w:val="Heading1"/>
       </w:pPr>
       <w:r>
-        <w:t>6. Kết luận và hạn chế</w:t>
+        <w:t>7. Kết luận và hạn chế</w:t>
       </w:r>
     </w:p>
     <w:p>
       <w:r>
-        <w:t>Bài 1 cho thấy A* đạt cùng chi phí tối ưu với Dijkstra nhưng có thể giảm số nút mở rộng nhờ heuristic; đồ thị được cập nhật khi có sự cố. Bài 2 cho thấy hệ luật giúp kiểm soát tính đúng đắn, còn LLM phù hợp làm lớp giao tiếp.</w:t>
+        <w:t>Bài 1 cho thấy A* đạt cùng chi phí tối ưu với Dijkstra nhưng có thể giảm số nút mở rộng nhờ heuristic; đồ thị được cập nhật khi có sự cố. Bài 2 cho thấy hệ luật giúp kiểm soát tính đúng đắn, còn LLM phù hợp làm lớp giao tiếp. Bài 3 cho thấy mạng ngữ nghĩa và câu hỏi chia đôi giúp thu hẹp không gian ứng viên có hệ thống thay vì đoán ngẫu nhiên.</w:t>
       </w:r>
     </w:p>
     <w:p>
       <w:r>
-        <w:t>Hạn chế: dữ liệu bản đồ là giả lập, heuristic chưa dùng bản đồ GPS thật, luật tuyển sinh không đại diện cho quy chế của một trường cụ thể, và demo không gọi LLM bên ngoài nên không đo được chất lượng hội thoại thực tế.</w:t>
+        <w:t>Hạn chế: dữ liệu bản đồ, luật tuyển sinh và mạng nhân vật đều là giả lập; heuristic chưa dùng bản đồ GPS thật; phiên bản hiện tại mô phỏng LLM cục bộ nên chưa đo chất lượng hội thoại tự nhiên của mô hình bên ngoài.</w:t>
       </w:r>
     </w:p>
     <w:sectPr>

</xml_diff>